<commit_message>
Add call to action to CSM Brazil blog (EN and DE)
Co-Authored-By: Claude Sonnet 5.5 <noreply@anthropic.com>
Claude-Session: https://claude.ai/code/session_01AffxbPweSyt4EQXPYTZnAG
</commit_message>
<xml_diff>
--- a/CSM_Brazil_Release_Blog.docx
+++ b/CSM_Brazil_Release_Blog.docx
@@ -240,7 +240,27 @@
         <w:spacing w:after="140" w:line="300"/>
       </w:pPr>
       <w:r>
-        <w:t xml:space="preserve">Brazil makes CSM more open, more connected and more precise: AI that works across tools, voice that starts on your portal, proactive service for business customers, and stronger data and workforce management. Contact us to discuss which of these can deliver the most value for your service organization.</w:t>
+        <w:t xml:space="preserve">Brazil makes CSM more open, more connected and more precise: AI that works across tools, voice that starts on your portal, proactive service for business customers, and stronger data and workforce management.</w:t>
+      </w:r>
+    </w:p>
+    <w:p>
+      <w:pPr>
+        <w:pBdr>
+          <w:left w:val="single" w:color="1F4E79" w:sz="24" w:space="8"/>
+        </w:pBdr>
+        <w:shd w:fill="EAF1F8" w:val="clear"/>
+        <w:spacing w:after="140" w:before="200"/>
+      </w:pPr>
+      <w:r>
+        <w:rPr>
+          <w:b/>
+          <w:bCs/>
+          <w:color w:val="1F4E79"/>
+        </w:rPr>
+        <w:t xml:space="preserve">Talk to the experts. </w:t>
+      </w:r>
+      <w:r>
+        <w:t xml:space="preserve">For more insights like these, or to partner with us on your implementation, contact us. We are the experts in ServiceNow CSM implementations and can help you turn the Brazil release into real results for your service organization.</w:t>
       </w:r>
     </w:p>
     <w:p>
@@ -276,7 +296,7 @@
         </w:numPr>
         <w:spacing w:after="60"/>
       </w:pPr>
-      <w:hyperlink w:history="1" r:id="rIdibyajsvtb86_jm33dx4rw">
+      <w:hyperlink w:history="1" r:id="rIduxij9-pvv6gj0rnrlyj1v">
         <w:r>
           <w:rPr>
             <w:rStyle w:val="Hyperlink"/>
@@ -294,7 +314,7 @@
         </w:numPr>
         <w:spacing w:after="60"/>
       </w:pPr>
-      <w:hyperlink w:history="1" r:id="rIdqqnp4zzzdxyqkjfekiy0l">
+      <w:hyperlink w:history="1" r:id="rId1yftyibo-u5sx4szlqqrx">
         <w:r>
           <w:rPr>
             <w:rStyle w:val="Hyperlink"/>
@@ -312,7 +332,7 @@
         </w:numPr>
         <w:spacing w:after="60"/>
       </w:pPr>
-      <w:hyperlink w:history="1" r:id="rIdiawoaoqysvec0gy_6xy2-">
+      <w:hyperlink w:history="1" r:id="rId-u8nolblkabkhwly2f2nw">
         <w:r>
           <w:rPr>
             <w:rStyle w:val="Hyperlink"/>
@@ -330,7 +350,7 @@
         </w:numPr>
         <w:spacing w:after="60"/>
       </w:pPr>
-      <w:hyperlink w:history="1" r:id="rIdmn9sse2izey8xkrafrswj">
+      <w:hyperlink w:history="1" r:id="rIdzmdpbpmnuwbealarqiiqh">
         <w:r>
           <w:rPr>
             <w:rStyle w:val="Hyperlink"/>
@@ -348,7 +368,7 @@
         </w:numPr>
         <w:spacing w:after="60"/>
       </w:pPr>
-      <w:hyperlink w:history="1" r:id="rIdstfdqjpdmqnfnx8aflcrf">
+      <w:hyperlink w:history="1" r:id="rIdbz_wmkz58-y9dmeggwvx1">
         <w:r>
           <w:rPr>
             <w:rStyle w:val="Hyperlink"/>
@@ -366,7 +386,7 @@
         </w:numPr>
         <w:spacing w:after="60"/>
       </w:pPr>
-      <w:hyperlink w:history="1" r:id="rId44hzbkmv-i-3uxrifoxbs">
+      <w:hyperlink w:history="1" r:id="rIdepadrwujs9hkighozo59_">
         <w:r>
           <w:rPr>
             <w:rStyle w:val="Hyperlink"/>

</xml_diff>